<commit_message>
improve(report): update report template
</commit_message>
<xml_diff>
--- a/src/modules/report/templates/genetics_report_template.docx
+++ b/src/modules/report/templates/genetics_report_template.docx
@@ -1230,6 +1230,18 @@
     </w:p>
     <w:p>
       <w:pPr>
+        <w:pStyle w:val="ListParagraph"/>
+        <w:tabs>
+          <w:tab w:val="left" w:pos="517"/>
+        </w:tabs>
+        <w:spacing w:line="237" w:lineRule="auto"/>
+        <w:rPr>
+          <w:sz w:val="19"/>
+        </w:rPr>
+      </w:pPr>
+    </w:p>
+    <w:p>
+      <w:pPr>
         <w:spacing w:before="85"/>
         <w:ind w:left="305"/>
         <w:rPr>
@@ -1276,8 +1288,7 @@
     </w:p>
     <w:tbl>
       <w:tblPr>
-        <w:tblW w:w="4371" w:type="pct"/>
-        <w:tblInd w:w="631" w:type="dxa"/>
+        <w:tblW w:w="5000" w:type="pct"/>
         <w:tblBorders>
           <w:top w:val="single" w:sz="8" w:space="0" w:color="AAB7C4"/>
           <w:left w:val="single" w:sz="8" w:space="0" w:color="AAB7C4"/>
@@ -1286,15 +1297,15 @@
           <w:insideH w:val="single" w:sz="8" w:space="0" w:color="AAB7C4"/>
           <w:insideV w:val="single" w:sz="8" w:space="0" w:color="AAB7C4"/>
         </w:tblBorders>
-        <w:tblLayout w:type="fixed"/>
         <w:tblLook w:val="04A0" w:firstRow="1" w:lastRow="0" w:firstColumn="1" w:lastColumn="0" w:noHBand="0" w:noVBand="1"/>
       </w:tblPr>
       <w:tblGrid>
-        <w:gridCol w:w="1314"/>
-        <w:gridCol w:w="2983"/>
-        <w:gridCol w:w="1432"/>
-        <w:gridCol w:w="1730"/>
-        <w:gridCol w:w="2804"/>
+        <w:gridCol w:w="1264"/>
+        <w:gridCol w:w="1783"/>
+        <w:gridCol w:w="2050"/>
+        <w:gridCol w:w="1557"/>
+        <w:gridCol w:w="2245"/>
+        <w:gridCol w:w="2841"/>
       </w:tblGrid>
       <w:tr>
         <w:trPr>
@@ -1304,7 +1315,7 @@
         </w:trPr>
         <w:tc>
           <w:tcPr>
-            <w:tcW w:w="1313" w:type="dxa"/>
+            <w:tcW w:w="538" w:type="pct"/>
             <w:shd w:val="clear" w:color="auto" w:fill="2A99C1"/>
             <w:tcMar>
               <w:top w:w="105" w:type="dxa"/>
@@ -1334,7 +1345,7 @@
         </w:tc>
         <w:tc>
           <w:tcPr>
-            <w:tcW w:w="2983" w:type="dxa"/>
+            <w:tcW w:w="759" w:type="pct"/>
             <w:shd w:val="clear" w:color="auto" w:fill="2A99C1"/>
             <w:tcMar>
               <w:top w:w="105" w:type="dxa"/>
@@ -1365,7 +1376,7 @@
         </w:tc>
         <w:tc>
           <w:tcPr>
-            <w:tcW w:w="1432" w:type="dxa"/>
+            <w:tcW w:w="873" w:type="pct"/>
             <w:shd w:val="clear" w:color="auto" w:fill="2A99C1"/>
             <w:tcMar>
               <w:top w:w="105" w:type="dxa"/>
@@ -1387,15 +1398,14 @@
               <w:rPr>
                 <w:b/>
                 <w:color w:val="FFFFFF" w:themeColor="background1"/>
-                <w:sz w:val="21"/>
-              </w:rPr>
-              <w:t>ZYGOSITY</w:t>
+              </w:rPr>
+              <w:t>TRANSCRIPT</w:t>
             </w:r>
           </w:p>
         </w:tc>
         <w:tc>
           <w:tcPr>
-            <w:tcW w:w="1730" w:type="dxa"/>
+            <w:tcW w:w="663" w:type="pct"/>
             <w:shd w:val="clear" w:color="auto" w:fill="2A99C1"/>
             <w:tcMar>
               <w:top w:w="105" w:type="dxa"/>
@@ -1419,13 +1429,73 @@
                 <w:color w:val="FFFFFF" w:themeColor="background1"/>
                 <w:sz w:val="21"/>
               </w:rPr>
-              <w:t>INHERITANCE</w:t>
+              <w:t>COVERAGE</w:t>
             </w:r>
           </w:p>
         </w:tc>
         <w:tc>
           <w:tcPr>
-            <w:tcW w:w="2804" w:type="dxa"/>
+            <w:tcW w:w="956" w:type="pct"/>
+            <w:shd w:val="clear" w:color="auto" w:fill="2A99C1"/>
+          </w:tcPr>
+          <w:p>
+            <w:pPr>
+              <w:jc w:val="center"/>
+              <w:rPr>
+                <w:b/>
+                <w:color w:val="FFFFFF" w:themeColor="background1"/>
+                <w:sz w:val="21"/>
+              </w:rPr>
+            </w:pPr>
+            <w:r>
+              <w:rPr>
+                <w:b/>
+                <w:color w:val="FFFFFF" w:themeColor="background1"/>
+                <w:sz w:val="21"/>
+              </w:rPr>
+              <w:t>GNOMAD_ALL</w:t>
+            </w:r>
+          </w:p>
+          <w:p>
+            <w:pPr>
+              <w:jc w:val="center"/>
+              <w:rPr>
+                <w:b/>
+                <w:color w:val="FFFFFF" w:themeColor="background1"/>
+                <w:sz w:val="21"/>
+              </w:rPr>
+            </w:pPr>
+            <w:r>
+              <w:rPr>
+                <w:b/>
+                <w:color w:val="FFFFFF" w:themeColor="background1"/>
+                <w:sz w:val="21"/>
+              </w:rPr>
+              <w:t>GNOMAD_AMR</w:t>
+            </w:r>
+          </w:p>
+          <w:p>
+            <w:pPr>
+              <w:jc w:val="center"/>
+              <w:rPr>
+                <w:b/>
+                <w:color w:val="FFFFFF" w:themeColor="background1"/>
+                <w:sz w:val="21"/>
+              </w:rPr>
+            </w:pPr>
+            <w:r>
+              <w:rPr>
+                <w:b/>
+                <w:color w:val="FFFFFF" w:themeColor="background1"/>
+                <w:sz w:val="21"/>
+              </w:rPr>
+              <w:t>GNOMAD_AFR</w:t>
+            </w:r>
+          </w:p>
+        </w:tc>
+        <w:tc>
+          <w:tcPr>
+            <w:tcW w:w="1210" w:type="pct"/>
             <w:shd w:val="clear" w:color="auto" w:fill="2A99C1"/>
             <w:tcMar>
               <w:top w:w="105" w:type="dxa"/>
@@ -1461,7 +1531,7 @@
         </w:trPr>
         <w:tc>
           <w:tcPr>
-            <w:tcW w:w="1313" w:type="dxa"/>
+            <w:tcW w:w="538" w:type="pct"/>
             <w:tcMar>
               <w:top w:w="105" w:type="dxa"/>
               <w:left w:w="110" w:type="dxa"/>
@@ -1501,7 +1571,7 @@
         </w:tc>
         <w:tc>
           <w:tcPr>
-            <w:tcW w:w="2983" w:type="dxa"/>
+            <w:tcW w:w="759" w:type="pct"/>
             <w:tcMar>
               <w:top w:w="105" w:type="dxa"/>
               <w:left w:w="110" w:type="dxa"/>
@@ -1522,7 +1592,7 @@
         </w:tc>
         <w:tc>
           <w:tcPr>
-            <w:tcW w:w="1432" w:type="dxa"/>
+            <w:tcW w:w="873" w:type="pct"/>
             <w:tcMar>
               <w:top w:w="105" w:type="dxa"/>
               <w:left w:w="110" w:type="dxa"/>
@@ -1537,13 +1607,19 @@
               <w:jc w:val="center"/>
             </w:pPr>
             <w:r>
-              <w:t>{zygosity}</w:t>
+              <w:t>{</w:t>
+            </w:r>
+            <w:r>
+              <w:t>transcript</w:t>
+            </w:r>
+            <w:r>
+              <w:t>}</w:t>
             </w:r>
           </w:p>
         </w:tc>
         <w:tc>
           <w:tcPr>
-            <w:tcW w:w="1730" w:type="dxa"/>
+            <w:tcW w:w="663" w:type="pct"/>
             <w:tcMar>
               <w:top w:w="105" w:type="dxa"/>
               <w:left w:w="110" w:type="dxa"/>
@@ -1558,13 +1634,63 @@
               <w:jc w:val="center"/>
             </w:pPr>
             <w:r>
-              <w:t>{inheritance}</w:t>
+              <w:t>{</w:t>
+            </w:r>
+            <w:r>
+              <w:t>coverage</w:t>
+            </w:r>
+            <w:r>
+              <w:t>}</w:t>
             </w:r>
           </w:p>
         </w:tc>
         <w:tc>
           <w:tcPr>
-            <w:tcW w:w="2804" w:type="dxa"/>
+            <w:tcW w:w="956" w:type="pct"/>
+          </w:tcPr>
+          <w:p>
+            <w:pPr>
+              <w:spacing w:line="259" w:lineRule="auto"/>
+              <w:jc w:val="center"/>
+            </w:pPr>
+            <w:r>
+              <w:t>{#gad}</w:t>
+            </w:r>
+          </w:p>
+          <w:p>
+            <w:pPr>
+              <w:spacing w:line="259" w:lineRule="auto"/>
+              <w:jc w:val="center"/>
+            </w:pPr>
+            <w:r>
+              <w:t>{</w:t>
+            </w:r>
+            <w:r>
+              <w:t>value</w:t>
+            </w:r>
+            <w:r>
+              <w:t>}</w:t>
+            </w:r>
+          </w:p>
+          <w:p>
+            <w:pPr>
+              <w:spacing w:line="259" w:lineRule="auto"/>
+              <w:jc w:val="center"/>
+            </w:pPr>
+            <w:r>
+              <w:t>{</w:t>
+            </w:r>
+            <w:r>
+              <w:t>/</w:t>
+            </w:r>
+            <w:r>
+              <w:t>gad}</w:t>
+            </w:r>
+          </w:p>
+        </w:tc>
+        <w:tc>
+          <w:tcPr>
+            <w:tcW w:w="1210" w:type="pct"/>
             <w:tcMar>
               <w:top w:w="105" w:type="dxa"/>
               <w:left w:w="110" w:type="dxa"/>
@@ -1705,15 +1831,6 @@
     </w:p>
     <w:p>
       <w:pPr>
-        <w:pStyle w:val="BodyText"/>
-        <w:spacing w:before="33"/>
-        <w:rPr>
-          <w:b/>
-        </w:rPr>
-      </w:pPr>
-    </w:p>
-    <w:p>
-      <w:pPr>
         <w:pStyle w:val="ListBullet"/>
         <w:numPr>
           <w:ilvl w:val="0"/>
@@ -1824,295 +1941,107 @@
         <w:spacing w:line="237" w:lineRule="auto"/>
         <w:ind w:left="305" w:right="302"/>
         <w:jc w:val="both"/>
-      </w:pPr>
-      <w:r>
-        <w:t>Whole Exome Sequencing of this sample is carried out in the</w:t>
-      </w:r>
-      <w:r>
-        <w:rPr>
-          <w:spacing w:val="-4"/>
-        </w:rPr>
-        <w:t xml:space="preserve"> </w:t>
-      </w:r>
-      <w:proofErr w:type="spellStart"/>
-      <w:r>
-        <w:t>Azenta</w:t>
-      </w:r>
-      <w:proofErr w:type="spellEnd"/>
-      <w:r>
-        <w:t xml:space="preserve"> CLIA</w:t>
-      </w:r>
-      <w:r>
-        <w:rPr>
-          <w:spacing w:val="-4"/>
-        </w:rPr>
-        <w:t xml:space="preserve"> </w:t>
-      </w:r>
-      <w:r>
-        <w:t xml:space="preserve">lab (#), followed by bioinformatic analysis and clinical reporting performed at </w:t>
-      </w:r>
-      <w:r>
-        <w:t>Genetics</w:t>
-      </w:r>
-      <w:r>
-        <w:t>.</w:t>
-      </w:r>
-      <w:r>
-        <w:rPr>
-          <w:spacing w:val="-4"/>
-        </w:rPr>
-        <w:t xml:space="preserve"> </w:t>
-      </w:r>
-      <w:r>
-        <w:t xml:space="preserve">An </w:t>
-      </w:r>
-      <w:proofErr w:type="gramStart"/>
-      <w:r>
-        <w:t>end to end</w:t>
-      </w:r>
-      <w:proofErr w:type="gramEnd"/>
-      <w:r>
-        <w:t xml:space="preserve"> in-house bioinformatics pipeline including base calling, alignment of reads to </w:t>
-      </w:r>
-      <w:r>
-        <w:lastRenderedPageBreak/>
-        <w:t xml:space="preserve">GRCh37 genome assembly, primary filtering out of low-quality reads and probable artefacts, and subsequent annotation of variants, is applied. Approximately, all disease-causing variants reported in </w:t>
-      </w:r>
-      <w:proofErr w:type="spellStart"/>
-      <w:r>
-        <w:t>ClinVar</w:t>
-      </w:r>
-      <w:proofErr w:type="spellEnd"/>
-      <w:r>
-        <w:t xml:space="preserve"> as well as all variants with</w:t>
-      </w:r>
-      <w:r>
-        <w:rPr>
-          <w:spacing w:val="80"/>
-        </w:rPr>
-        <w:t xml:space="preserve"> </w:t>
-      </w:r>
-      <w:r>
-        <w:t>minor</w:t>
-      </w:r>
-      <w:r>
-        <w:rPr>
-          <w:spacing w:val="33"/>
-        </w:rPr>
-        <w:t xml:space="preserve"> </w:t>
-      </w:r>
-      <w:r>
-        <w:t>allele</w:t>
-      </w:r>
-      <w:r>
-        <w:rPr>
-          <w:spacing w:val="33"/>
-        </w:rPr>
-        <w:t xml:space="preserve"> </w:t>
-      </w:r>
-      <w:r>
-        <w:t>frequency</w:t>
-      </w:r>
-      <w:r>
-        <w:rPr>
-          <w:spacing w:val="33"/>
-        </w:rPr>
-        <w:t xml:space="preserve"> </w:t>
-      </w:r>
-      <w:r>
-        <w:t>(MAF)</w:t>
-      </w:r>
-      <w:r>
-        <w:rPr>
-          <w:spacing w:val="33"/>
-        </w:rPr>
-        <w:t xml:space="preserve"> </w:t>
-      </w:r>
-      <w:r>
-        <w:t>of</w:t>
-      </w:r>
-      <w:r>
-        <w:rPr>
-          <w:spacing w:val="33"/>
-        </w:rPr>
-        <w:t xml:space="preserve"> </w:t>
-      </w:r>
-      <w:r>
-        <w:t>less</w:t>
-      </w:r>
-      <w:r>
-        <w:rPr>
-          <w:spacing w:val="33"/>
-        </w:rPr>
-        <w:t xml:space="preserve"> </w:t>
-      </w:r>
-      <w:r>
-        <w:t>than</w:t>
-      </w:r>
-      <w:r>
-        <w:rPr>
-          <w:spacing w:val="33"/>
-        </w:rPr>
-        <w:t xml:space="preserve"> </w:t>
-      </w:r>
-      <w:r>
-        <w:t>1%</w:t>
-      </w:r>
-      <w:r>
-        <w:rPr>
-          <w:spacing w:val="33"/>
-        </w:rPr>
-        <w:t xml:space="preserve"> </w:t>
-      </w:r>
-      <w:r>
-        <w:t>in</w:t>
-      </w:r>
-      <w:r>
-        <w:rPr>
-          <w:spacing w:val="33"/>
-        </w:rPr>
-        <w:t xml:space="preserve"> </w:t>
-      </w:r>
-      <w:proofErr w:type="spellStart"/>
-      <w:r>
-        <w:t>gnomAD</w:t>
-      </w:r>
-      <w:proofErr w:type="spellEnd"/>
-      <w:r>
-        <w:rPr>
-          <w:spacing w:val="33"/>
-        </w:rPr>
-        <w:t xml:space="preserve"> </w:t>
-      </w:r>
-      <w:r>
-        <w:t>database</w:t>
-      </w:r>
-      <w:r>
-        <w:rPr>
-          <w:spacing w:val="33"/>
-        </w:rPr>
-        <w:t xml:space="preserve"> </w:t>
-      </w:r>
-      <w:r>
-        <w:t>are</w:t>
-      </w:r>
-      <w:r>
-        <w:rPr>
-          <w:spacing w:val="33"/>
-        </w:rPr>
-        <w:t xml:space="preserve"> </w:t>
-      </w:r>
-      <w:r>
-        <w:t>considered.</w:t>
-      </w:r>
-      <w:r>
-        <w:rPr>
-          <w:spacing w:val="33"/>
-        </w:rPr>
-        <w:t xml:space="preserve"> </w:t>
-      </w:r>
-      <w:r>
-        <w:t>Evaluation</w:t>
-      </w:r>
-      <w:r>
-        <w:rPr>
-          <w:spacing w:val="33"/>
-        </w:rPr>
-        <w:t xml:space="preserve"> </w:t>
-      </w:r>
-      <w:r>
-        <w:t>is</w:t>
-      </w:r>
-      <w:r>
-        <w:rPr>
-          <w:spacing w:val="33"/>
-        </w:rPr>
-        <w:t xml:space="preserve"> </w:t>
-      </w:r>
-      <w:r>
-        <w:t>focused</w:t>
-      </w:r>
-      <w:r>
-        <w:rPr>
-          <w:spacing w:val="33"/>
-        </w:rPr>
-        <w:t xml:space="preserve"> </w:t>
-      </w:r>
-      <w:r>
-        <w:t>on</w:t>
-      </w:r>
-      <w:r>
-        <w:rPr>
-          <w:spacing w:val="33"/>
-        </w:rPr>
-        <w:t xml:space="preserve"> </w:t>
-      </w:r>
-      <w:r>
-        <w:t>coding</w:t>
-      </w:r>
-      <w:r>
-        <w:rPr>
-          <w:spacing w:val="33"/>
-        </w:rPr>
-        <w:t xml:space="preserve"> </w:t>
-      </w:r>
-      <w:r>
-        <w:t>exons along with flanking intronic bases of 43 genes related to cancers (genes included in the analysis listed at the end of method section).</w:t>
-      </w:r>
-      <w:r>
-        <w:rPr>
-          <w:spacing w:val="-5"/>
-        </w:rPr>
-        <w:t xml:space="preserve"> </w:t>
-      </w:r>
-      <w:r>
-        <w:t>All pertinent inheritance patterns are considered. In addition, provided family history and clinical information are used to evaluate eventually identified variants. All identified small SNV/indels are evaluated with respect to their pathogenicity and causality, and these are categorized into classes pathogenic, likely pathogenic, variant of unknown significance (VUS), likely benign and benign. All potentially causative variants in genes related to the phenotype of the patient, except benign or likely benign variants, are reported. Variants of relevance identified by NGS are continuously and individually validated for quality aspects; those variants which meet our internal QC criteria (based on extensive validation processes) are not validated by</w:t>
-      </w:r>
-      <w:r>
-        <w:rPr>
-          <w:spacing w:val="40"/>
-        </w:rPr>
-        <w:t xml:space="preserve"> </w:t>
-      </w:r>
-      <w:r>
-        <w:rPr>
-          <w:spacing w:val="-2"/>
-        </w:rPr>
-        <w:t>Sanger.</w:t>
+        <w:rPr>
+          <w:lang w:val="vi-VN"/>
+        </w:rPr>
+      </w:pPr>
+      <w:r>
+        <w:rPr>
+          <w:lang w:val="vi-VN"/>
+        </w:rPr>
+        <w:t>Sequencing of this sample is performed by an accredited sequencing facility, followed by bioinformatic analysis and clinical reporting performed by the reporting laboratory. An end-to-end in-house bioinformatics pipeline is applied, supporting both GRCh37 (hg19) and GRCh38 (hg38) reference genome assemblies. The pipeline accepts either raw FASTQ files or pre-called VCF files as input.</w:t>
       </w:r>
     </w:p>
     <w:p>
       <w:pPr>
         <w:pStyle w:val="BodyText"/>
-        <w:spacing w:before="212" w:line="237" w:lineRule="auto"/>
-        <w:ind w:left="305" w:right="329"/>
+        <w:spacing w:line="237" w:lineRule="auto"/>
+        <w:ind w:left="305" w:right="302"/>
         <w:jc w:val="both"/>
-      </w:pPr>
-      <w:r>
-        <w:rPr>
-          <w:b/>
-        </w:rPr>
-        <w:t>Gene List:</w:t>
-      </w:r>
-      <w:r>
-        <w:rPr>
-          <w:b/>
-          <w:spacing w:val="-6"/>
-        </w:rPr>
-        <w:t xml:space="preserve"> </w:t>
-      </w:r>
-      <w:r>
-        <w:t>APC, BAP1, BARD1, BMPR1A, BRCA1, BRCA2, BRIP1, CDH1, CDK4, CDKN2A, CHEK2, EPCAM, GREM1, MITF, MLH1, MSH2, MSH6, MUTYH, NBN, PALB2, PMS2, POLD1, POLE1, PTEN, RAD51C, RAD51D, SMAD4, STK11, TP53, XRCC2, XRCC3, DDB2, ERCC2, ERCC3, ERCC4, ERCC5, POLH, XPA, XPC, PMS1, RAD50, RECQL, FANCC</w:t>
-      </w:r>
+        <w:rPr>
+          <w:lang w:val="vi-VN"/>
+        </w:rPr>
+      </w:pPr>
     </w:p>
     <w:p>
       <w:pPr>
         <w:pStyle w:val="BodyText"/>
-      </w:pPr>
+        <w:spacing w:line="237" w:lineRule="auto"/>
+        <w:ind w:left="305" w:right="302"/>
+        <w:jc w:val="both"/>
+        <w:rPr>
+          <w:lang w:val="vi-VN"/>
+        </w:rPr>
+      </w:pPr>
+      <w:r>
+        <w:rPr>
+          <w:lang w:val="vi-VN"/>
+        </w:rPr>
+        <w:t>FASTQ Analysis Pipeline: For samples submitted as raw reads, alignment to the selected reference genome is performed using BWA-MEM2. Duplicate reads are flagged using GATK MarkDuplicates, followed by Base Quality Score Recalibration (BQSR) with known variant sites from dbSNP and Mills indel databases. Variant calling is carried out using GATK HaplotypeCaller in gVCF mode (ploidy = 2), followed by joint genotyping with GenotypeGVCFs. Variant filtration is applied using GATK VariantFiltration with the following hard-filter thresholds: for SNVs — QD &lt; 2.0, FS &gt; 60.0, MQ &lt; 40.0, MQRankSum &lt; −12.5, ReadPosRankSum &lt; −8.0; for INDELs — QD &lt; 2.0, FS &gt; 200.0, ReadPosRankSum &lt; −20.0.</w:t>
+      </w:r>
     </w:p>
     <w:p>
       <w:pPr>
         <w:pStyle w:val="BodyText"/>
+        <w:spacing w:line="237" w:lineRule="auto"/>
+        <w:ind w:left="305" w:right="302"/>
+        <w:jc w:val="both"/>
+        <w:rPr>
+          <w:lang w:val="vi-VN"/>
+        </w:rPr>
+      </w:pPr>
+    </w:p>
+    <w:p>
+      <w:pPr>
+        <w:pStyle w:val="BodyText"/>
+        <w:spacing w:line="237" w:lineRule="auto"/>
+        <w:ind w:left="305" w:right="302"/>
+        <w:jc w:val="both"/>
+        <w:rPr>
+          <w:lang w:val="vi-VN"/>
+        </w:rPr>
+      </w:pPr>
+      <w:r>
+        <w:rPr>
+          <w:lang w:val="vi-VN"/>
+        </w:rPr>
+        <w:t>Variant Annotation: All variants passing quality filters are annotated using Ensembl Variant Effect Predictor (VEP) v101 in offline mode. Functional consequence prediction is augmented with the following VEP plugins: CADD (Combined Annotation-Dependent Depletion), REVEL, AlphaMissense, and SpliceAI. Annotated variants are further enriched through cross-referencing with the following databases: ClinVar (clinical significance), gnomAD Exomes and Genomes (population allele frequencies across AFR, AMR, ASJ, EAS, FIN, NFE, OTH, SAS populations), ExAC, 1000 Genomes Project, COSMIC (somatic mutation catalog), HGMD (Human Gene Mutation Database), and MasterMind. Pharmacogenomic annotations are incorporated from PharmaGKB. Pathogenicity in silico predictions are obtained from SIFT and PolyPhen-2.</w:t>
+      </w:r>
+    </w:p>
+    <w:p>
+      <w:pPr>
+        <w:pStyle w:val="BodyText"/>
+        <w:spacing w:line="237" w:lineRule="auto"/>
+        <w:ind w:left="305" w:right="302"/>
+        <w:jc w:val="both"/>
+        <w:rPr>
+          <w:lang w:val="vi-VN"/>
+        </w:rPr>
+      </w:pPr>
+    </w:p>
+    <w:p>
+      <w:pPr>
+        <w:pStyle w:val="BodyText"/>
+        <w:spacing w:line="237" w:lineRule="auto"/>
+        <w:ind w:left="305" w:right="302"/>
+        <w:jc w:val="both"/>
+        <w:rPr>
+          <w:lang w:val="vi-VN"/>
+        </w:rPr>
+      </w:pPr>
+      <w:r>
+        <w:rPr>
+          <w:lang w:val="vi-VN"/>
+        </w:rPr>
+        <w:t>Variant Prioritization and Classification: Variants with a minor allele frequency (MAF) ≥ 1% in gnomAD are considered likely benign and deprioritized. Evaluation focuses on coding exons and flanking intronic regions (canonical splice sites). All identified SNVs and small indels are classified according to the ACMG/AMP 2015 guidelines into five categories: Pathogenic, Likely Pathogenic, Variant of Uncertain Significance (VUS), Likely Benign, and Benign. Only Pathogenic, Likely Pathogenic, and VUS variants are reported. All relevant inheritance patterns are considered, and provided clinical information and family history are used to contextualize variant interpretation.</w:t>
+      </w:r>
+    </w:p>
+    <w:p>
+      <w:pPr>
+        <w:pStyle w:val="BodyText"/>
+        <w:rPr>
+          <w:lang w:val="vi-VN"/>
+        </w:rPr>
       </w:pPr>
     </w:p>
     <w:p>
@@ -2154,476 +2083,20 @@
         <w:spacing w:line="237" w:lineRule="auto"/>
         <w:ind w:left="305" w:right="300"/>
         <w:jc w:val="both"/>
-      </w:pPr>
-      <w:r>
-        <w:t>Test results are interpreted in the context of clinical findings, family history and other laboratory data. Only variations in genes potentially related to the proband's medical condition are reported. Rare polymorphisms may lead to false negative or positive results. Misinterpretation of results may occur if the information provided is inaccurate or incomplete. If results obtained do not match the clinical findings, additional testing should be considered. In addition, due to limitations in technology, certain regions may either not be covered or may be poorly covered, where variants cannot be confidently detected. Several genomic regions [BMPR1A</w:t>
-      </w:r>
-      <w:r>
-        <w:rPr>
-          <w:spacing w:val="72"/>
-          <w:w w:val="150"/>
-        </w:rPr>
-        <w:t xml:space="preserve"> </w:t>
-      </w:r>
-      <w:r>
-        <w:t>(NM_004329.2</w:t>
-      </w:r>
-      <w:proofErr w:type="gramStart"/>
-      <w:r>
-        <w:t>)</w:t>
-      </w:r>
-      <w:r>
-        <w:rPr>
-          <w:spacing w:val="28"/>
-        </w:rPr>
-        <w:t xml:space="preserve">  </w:t>
-      </w:r>
-      <w:r>
-        <w:t>exon</w:t>
-      </w:r>
-      <w:proofErr w:type="gramEnd"/>
-      <w:r>
-        <w:rPr>
-          <w:spacing w:val="28"/>
-        </w:rPr>
-        <w:t xml:space="preserve">  </w:t>
-      </w:r>
-      <w:proofErr w:type="gramStart"/>
-      <w:r>
-        <w:t>12;</w:t>
-      </w:r>
-      <w:r>
-        <w:rPr>
-          <w:spacing w:val="28"/>
-        </w:rPr>
-        <w:t xml:space="preserve">  </w:t>
-      </w:r>
-      <w:r>
-        <w:t>BRCA1</w:t>
-      </w:r>
-      <w:r>
-        <w:rPr>
-          <w:spacing w:val="27"/>
-        </w:rPr>
-        <w:t xml:space="preserve">  </w:t>
-      </w:r>
-      <w:r>
-        <w:t>(</w:t>
-      </w:r>
-      <w:proofErr w:type="gramEnd"/>
-      <w:r>
-        <w:t>NM_007294.3</w:t>
-      </w:r>
-      <w:proofErr w:type="gramStart"/>
-      <w:r>
-        <w:t>)</w:t>
-      </w:r>
-      <w:r>
-        <w:rPr>
-          <w:spacing w:val="28"/>
-        </w:rPr>
-        <w:t xml:space="preserve">  </w:t>
-      </w:r>
-      <w:r>
-        <w:t>exon</w:t>
-      </w:r>
-      <w:proofErr w:type="gramEnd"/>
-      <w:r>
-        <w:rPr>
-          <w:spacing w:val="28"/>
-        </w:rPr>
-        <w:t xml:space="preserve">  </w:t>
-      </w:r>
-      <w:proofErr w:type="gramStart"/>
-      <w:r>
-        <w:t>2;</w:t>
-      </w:r>
-      <w:r>
-        <w:rPr>
-          <w:spacing w:val="28"/>
-        </w:rPr>
-        <w:t xml:space="preserve">  </w:t>
-      </w:r>
-      <w:r>
-        <w:t>CHEK2</w:t>
-      </w:r>
-      <w:r>
-        <w:rPr>
-          <w:spacing w:val="29"/>
-        </w:rPr>
-        <w:t xml:space="preserve">  </w:t>
-      </w:r>
-      <w:r>
-        <w:t>(</w:t>
-      </w:r>
-      <w:proofErr w:type="gramEnd"/>
-      <w:r>
-        <w:t>NM_007194.4</w:t>
-      </w:r>
-      <w:proofErr w:type="gramStart"/>
-      <w:r>
-        <w:t>)</w:t>
-      </w:r>
-      <w:r>
-        <w:rPr>
-          <w:spacing w:val="28"/>
-        </w:rPr>
-        <w:t xml:space="preserve">  </w:t>
-      </w:r>
-      <w:r>
-        <w:t>exons</w:t>
-      </w:r>
-      <w:proofErr w:type="gramEnd"/>
-      <w:r>
-        <w:rPr>
-          <w:spacing w:val="29"/>
-        </w:rPr>
-        <w:t xml:space="preserve">  </w:t>
-      </w:r>
-      <w:r>
-        <w:t>11-</w:t>
-      </w:r>
-      <w:proofErr w:type="gramStart"/>
-      <w:r>
-        <w:t>15;</w:t>
-      </w:r>
-      <w:r>
-        <w:rPr>
-          <w:spacing w:val="28"/>
-        </w:rPr>
-        <w:t xml:space="preserve">  </w:t>
-      </w:r>
-      <w:r>
-        <w:rPr>
-          <w:spacing w:val="-4"/>
-        </w:rPr>
-        <w:t>PMS</w:t>
-      </w:r>
-      <w:proofErr w:type="gramEnd"/>
-      <w:r>
-        <w:rPr>
-          <w:spacing w:val="-4"/>
-        </w:rPr>
-        <w:t>2</w:t>
+        <w:rPr>
+          <w:lang w:val="vi-VN"/>
+        </w:rPr>
+      </w:pPr>
+      <w:r>
+        <w:rPr>
+          <w:lang w:val="vi-VN"/>
+        </w:rPr>
+        <w:t>Test results must be interpreted in the context of clinical findings, family history, and other laboratory data. This analysis is based on short-read next-generation sequencing technology, which has inherent limitations including reduced sensitivity in repetitive genomic regions, GC-rich sequences, and homologous gene segments. Large structural variants (SVs), copy number variants (CNVs), deep intronic variants, and complex rearrangements are not reliably detected by this assay and are therefore not reported. Variants in non-coding regulatory regions are generally not assessed unless they overlap with canonical splice sites or are otherwise flagged by SpliceAI prediction. Rare polymorphisms with population frequencies below established database thresholds may lead to false-negative or false-positive classifications. Misinterpretation of results may occur if clinical information provided is inaccurate or incomplete. If results do not correlate with clinical findings, additional orthogonal testing should be considered. Variant pathogenicity assessments are based on current knowledge and publicly available databases at the time of analysis; as knowledge evolves, prior classifications may be revised. The accuracy of population frequency estimates depends on the composition and size of reference cohorts in gnomAD and ExAC, which may underrepresent certain ethnic populations. Variant calls are assessed against internal quality metrics; variants that meet internal QC thresholds (minimum read depth, allele fraction, and strand bias criteria) are reported without orthogonal Sanger validation unless otherwise indicated.</w:t>
       </w:r>
     </w:p>
     <w:p>
       <w:pPr>
         <w:pStyle w:val="BodyText"/>
-        <w:spacing w:line="214" w:lineRule="exact"/>
-        <w:ind w:left="305"/>
-      </w:pPr>
-      <w:r>
-        <w:t>(NM_000535.7)</w:t>
-      </w:r>
-      <w:r>
-        <w:rPr>
-          <w:spacing w:val="49"/>
-        </w:rPr>
-        <w:t xml:space="preserve"> </w:t>
-      </w:r>
-      <w:r>
-        <w:t>exons</w:t>
-      </w:r>
-      <w:r>
-        <w:rPr>
-          <w:spacing w:val="49"/>
-        </w:rPr>
-        <w:t xml:space="preserve"> </w:t>
-      </w:r>
-      <w:r>
-        <w:t>1-5,</w:t>
-      </w:r>
-      <w:r>
-        <w:rPr>
-          <w:spacing w:val="49"/>
-        </w:rPr>
-        <w:t xml:space="preserve"> </w:t>
-      </w:r>
-      <w:r>
-        <w:t>9,</w:t>
-      </w:r>
-      <w:r>
-        <w:rPr>
-          <w:spacing w:val="49"/>
-        </w:rPr>
-        <w:t xml:space="preserve"> </w:t>
-      </w:r>
-      <w:r>
-        <w:t>11-15;</w:t>
-      </w:r>
-      <w:r>
-        <w:rPr>
-          <w:spacing w:val="49"/>
-        </w:rPr>
-        <w:t xml:space="preserve"> </w:t>
-      </w:r>
-      <w:r>
-        <w:t>POLH</w:t>
-      </w:r>
-      <w:r>
-        <w:rPr>
-          <w:spacing w:val="49"/>
-        </w:rPr>
-        <w:t xml:space="preserve"> </w:t>
-      </w:r>
-      <w:r>
-        <w:t>(NM_006502.2)</w:t>
-      </w:r>
-      <w:r>
-        <w:rPr>
-          <w:spacing w:val="49"/>
-        </w:rPr>
-        <w:t xml:space="preserve"> </w:t>
-      </w:r>
-      <w:r>
-        <w:t>exon</w:t>
-      </w:r>
-      <w:r>
-        <w:rPr>
-          <w:spacing w:val="50"/>
-        </w:rPr>
-        <w:t xml:space="preserve"> </w:t>
-      </w:r>
-      <w:r>
-        <w:t>4;</w:t>
-      </w:r>
-      <w:r>
-        <w:rPr>
-          <w:spacing w:val="49"/>
-        </w:rPr>
-        <w:t xml:space="preserve"> </w:t>
-      </w:r>
-      <w:r>
-        <w:t>PTEN</w:t>
-      </w:r>
-      <w:r>
-        <w:rPr>
-          <w:spacing w:val="49"/>
-        </w:rPr>
-        <w:t xml:space="preserve"> </w:t>
-      </w:r>
-      <w:r>
-        <w:t>(NM_000314.8)</w:t>
-      </w:r>
-      <w:r>
-        <w:rPr>
-          <w:spacing w:val="49"/>
-        </w:rPr>
-        <w:t xml:space="preserve"> </w:t>
-      </w:r>
-      <w:r>
-        <w:t>exon</w:t>
-      </w:r>
-      <w:r>
-        <w:rPr>
-          <w:spacing w:val="49"/>
-        </w:rPr>
-        <w:t xml:space="preserve"> </w:t>
-      </w:r>
-      <w:r>
-        <w:t>9]</w:t>
-      </w:r>
-      <w:r>
-        <w:rPr>
-          <w:spacing w:val="49"/>
-        </w:rPr>
-        <w:t xml:space="preserve"> </w:t>
-      </w:r>
-      <w:r>
-        <w:t>present</w:t>
-      </w:r>
-      <w:r>
-        <w:rPr>
-          <w:spacing w:val="49"/>
-        </w:rPr>
-        <w:t xml:space="preserve"> </w:t>
-      </w:r>
-      <w:r>
-        <w:t>difficulties</w:t>
-      </w:r>
-      <w:r>
-        <w:rPr>
-          <w:spacing w:val="49"/>
-        </w:rPr>
-        <w:t xml:space="preserve"> </w:t>
-      </w:r>
-      <w:r>
-        <w:rPr>
-          <w:spacing w:val="-5"/>
-        </w:rPr>
-        <w:t>in</w:t>
-      </w:r>
-    </w:p>
-    <w:p>
-      <w:pPr>
-        <w:pStyle w:val="BodyText"/>
-        <w:spacing w:line="216" w:lineRule="exact"/>
-        <w:ind w:left="305"/>
-      </w:pPr>
-      <w:r>
-        <w:t>mapping</w:t>
-      </w:r>
-      <w:r>
-        <w:rPr>
-          <w:spacing w:val="28"/>
-        </w:rPr>
-        <w:t xml:space="preserve"> </w:t>
-      </w:r>
-      <w:r>
-        <w:t>which</w:t>
-      </w:r>
-      <w:r>
-        <w:rPr>
-          <w:spacing w:val="29"/>
-        </w:rPr>
-        <w:t xml:space="preserve"> </w:t>
-      </w:r>
-      <w:r>
-        <w:t>may</w:t>
-      </w:r>
-      <w:r>
-        <w:rPr>
-          <w:spacing w:val="29"/>
-        </w:rPr>
-        <w:t xml:space="preserve"> </w:t>
-      </w:r>
-      <w:r>
-        <w:t>lead</w:t>
-      </w:r>
-      <w:r>
-        <w:rPr>
-          <w:spacing w:val="28"/>
-        </w:rPr>
-        <w:t xml:space="preserve"> </w:t>
-      </w:r>
-      <w:r>
-        <w:t>to</w:t>
-      </w:r>
-      <w:r>
-        <w:rPr>
-          <w:spacing w:val="29"/>
-        </w:rPr>
-        <w:t xml:space="preserve"> </w:t>
-      </w:r>
-      <w:r>
-        <w:t>false</w:t>
-      </w:r>
-      <w:r>
-        <w:rPr>
-          <w:spacing w:val="29"/>
-        </w:rPr>
-        <w:t xml:space="preserve"> </w:t>
-      </w:r>
-      <w:r>
-        <w:t>negative</w:t>
-      </w:r>
-      <w:r>
-        <w:rPr>
-          <w:spacing w:val="29"/>
-        </w:rPr>
-        <w:t xml:space="preserve"> </w:t>
-      </w:r>
-      <w:r>
-        <w:t>result</w:t>
-      </w:r>
-      <w:r>
-        <w:rPr>
-          <w:spacing w:val="28"/>
-        </w:rPr>
-        <w:t xml:space="preserve"> </w:t>
-      </w:r>
-      <w:r>
-        <w:t>[PMID:</w:t>
-      </w:r>
-      <w:r>
-        <w:rPr>
-          <w:spacing w:val="29"/>
-        </w:rPr>
-        <w:t xml:space="preserve"> </w:t>
-      </w:r>
-      <w:r>
-        <w:t>11880951,</w:t>
-      </w:r>
-      <w:r>
-        <w:rPr>
-          <w:spacing w:val="29"/>
-        </w:rPr>
-        <w:t xml:space="preserve"> </w:t>
-      </w:r>
-      <w:r>
-        <w:t>34202044,</w:t>
-      </w:r>
-      <w:r>
-        <w:rPr>
-          <w:spacing w:val="29"/>
-        </w:rPr>
-        <w:t xml:space="preserve"> </w:t>
-      </w:r>
-      <w:r>
-        <w:t>15832305,</w:t>
-      </w:r>
-      <w:r>
-        <w:rPr>
-          <w:spacing w:val="28"/>
-        </w:rPr>
-        <w:t xml:space="preserve"> </w:t>
-      </w:r>
-      <w:r>
-        <w:t>34630562,</w:t>
-      </w:r>
-      <w:r>
-        <w:rPr>
-          <w:spacing w:val="29"/>
-        </w:rPr>
-        <w:t xml:space="preserve"> </w:t>
-      </w:r>
-      <w:r>
-        <w:t>10939935,</w:t>
-      </w:r>
-      <w:r>
-        <w:rPr>
-          <w:spacing w:val="29"/>
-        </w:rPr>
-        <w:t xml:space="preserve"> </w:t>
-      </w:r>
-      <w:r>
-        <w:rPr>
-          <w:spacing w:val="-2"/>
-        </w:rPr>
-        <w:t>36674914,</w:t>
-      </w:r>
-    </w:p>
-    <w:p>
-      <w:pPr>
-        <w:pStyle w:val="BodyText"/>
-        <w:spacing w:line="217" w:lineRule="exact"/>
-        <w:ind w:left="305"/>
-      </w:pPr>
-      <w:r>
-        <w:t xml:space="preserve">8586419, </w:t>
-      </w:r>
-      <w:r>
-        <w:rPr>
-          <w:spacing w:val="-2"/>
-        </w:rPr>
-        <w:t>9620558].</w:t>
-      </w:r>
-    </w:p>
-    <w:p>
-      <w:pPr>
-        <w:pStyle w:val="BodyText"/>
-      </w:pPr>
-    </w:p>
-    <w:p>
-      <w:pPr>
-        <w:pStyle w:val="BodyText"/>
-      </w:pPr>
-    </w:p>
-    <w:p>
-      <w:pPr>
-        <w:pStyle w:val="BodyText"/>
-        <w:spacing w:before="2"/>
       </w:pPr>
     </w:p>
     <w:p>
@@ -2632,6 +2105,16 @@
           <w:b/>
           <w:color w:val="2B99C1"/>
           <w:sz w:val="19"/>
+          <w:lang w:val="vi-VN"/>
+        </w:rPr>
+      </w:pPr>
+    </w:p>
+    <w:p>
+      <w:pPr>
+        <w:ind w:left="305"/>
+        <w:rPr>
+          <w:b/>
+          <w:sz w:val="19"/>
         </w:rPr>
       </w:pPr>
       <w:r>
@@ -2640,24 +2123,6 @@
           <w:color w:val="2B99C1"/>
           <w:sz w:val="19"/>
         </w:rPr>
-        <w:br w:type="page"/>
-      </w:r>
-    </w:p>
-    <w:p>
-      <w:pPr>
-        <w:ind w:left="305"/>
-        <w:rPr>
-          <w:b/>
-          <w:sz w:val="19"/>
-        </w:rPr>
-      </w:pPr>
-      <w:r>
-        <w:rPr>
-          <w:b/>
-          <w:color w:val="2B99C1"/>
-          <w:sz w:val="19"/>
-        </w:rPr>
-        <w:lastRenderedPageBreak/>
         <w:t xml:space="preserve">ADDITIONAL </w:t>
       </w:r>
       <w:r>
@@ -2685,475 +2150,16 @@
         <w:spacing w:line="237" w:lineRule="auto"/>
         <w:ind w:left="305" w:right="282"/>
         <w:jc w:val="both"/>
-      </w:pPr>
-      <w:r>
-        <w:t xml:space="preserve">This test was developed and its performance validated by </w:t>
-      </w:r>
-      <w:r>
-        <w:t>Genetics</w:t>
-      </w:r>
-      <w:r>
-        <w:t>. The US Food and Drug Administration (FDA) has determined that clearance or approval of this method is not necessary and thus neither have been obtained. This test has been</w:t>
-      </w:r>
-      <w:r>
-        <w:rPr>
-          <w:spacing w:val="40"/>
-        </w:rPr>
-        <w:t xml:space="preserve"> </w:t>
-      </w:r>
-      <w:r>
-        <w:t>developed</w:t>
-      </w:r>
-      <w:r>
-        <w:rPr>
-          <w:spacing w:val="40"/>
-        </w:rPr>
-        <w:t xml:space="preserve"> </w:t>
-      </w:r>
-      <w:r>
-        <w:t>for</w:t>
-      </w:r>
-      <w:r>
-        <w:rPr>
-          <w:spacing w:val="40"/>
-        </w:rPr>
-        <w:t xml:space="preserve"> </w:t>
-      </w:r>
-      <w:r>
-        <w:t>clinical</w:t>
-      </w:r>
-      <w:r>
-        <w:rPr>
-          <w:spacing w:val="40"/>
-        </w:rPr>
-        <w:t xml:space="preserve"> </w:t>
-      </w:r>
-      <w:r>
-        <w:t>purposes. All</w:t>
-      </w:r>
-      <w:r>
-        <w:rPr>
-          <w:spacing w:val="40"/>
-        </w:rPr>
-        <w:t xml:space="preserve"> </w:t>
-      </w:r>
-      <w:r>
-        <w:t>test</w:t>
-      </w:r>
-      <w:r>
-        <w:rPr>
-          <w:spacing w:val="40"/>
-        </w:rPr>
-        <w:t xml:space="preserve"> </w:t>
-      </w:r>
-      <w:r>
-        <w:t>results</w:t>
-      </w:r>
-      <w:r>
-        <w:rPr>
-          <w:spacing w:val="40"/>
-        </w:rPr>
-        <w:t xml:space="preserve"> </w:t>
-      </w:r>
-      <w:r>
-        <w:t>are</w:t>
-      </w:r>
-      <w:r>
-        <w:rPr>
-          <w:spacing w:val="40"/>
-        </w:rPr>
-        <w:t xml:space="preserve"> </w:t>
-      </w:r>
-      <w:r>
-        <w:t>reviewed,</w:t>
-      </w:r>
-      <w:r>
-        <w:rPr>
-          <w:spacing w:val="40"/>
-        </w:rPr>
-        <w:t xml:space="preserve"> </w:t>
-      </w:r>
-      <w:r>
-        <w:t>interpreted</w:t>
-      </w:r>
-      <w:r>
-        <w:rPr>
-          <w:spacing w:val="40"/>
-        </w:rPr>
-        <w:t xml:space="preserve"> </w:t>
-      </w:r>
-      <w:r>
-        <w:t>and</w:t>
-      </w:r>
-      <w:r>
-        <w:rPr>
-          <w:spacing w:val="40"/>
-        </w:rPr>
-        <w:t xml:space="preserve"> </w:t>
-      </w:r>
-      <w:r>
-        <w:t>reported</w:t>
-      </w:r>
-      <w:r>
-        <w:rPr>
-          <w:spacing w:val="40"/>
-        </w:rPr>
-        <w:t xml:space="preserve"> </w:t>
-      </w:r>
-      <w:r>
-        <w:t>by</w:t>
-      </w:r>
-      <w:r>
-        <w:rPr>
-          <w:spacing w:val="40"/>
-        </w:rPr>
-        <w:t xml:space="preserve"> </w:t>
-      </w:r>
-      <w:r>
-        <w:t>our</w:t>
-      </w:r>
-      <w:r>
-        <w:rPr>
-          <w:spacing w:val="40"/>
-        </w:rPr>
-        <w:t xml:space="preserve"> </w:t>
-      </w:r>
-      <w:r>
-        <w:t>scientific</w:t>
-      </w:r>
-      <w:r>
-        <w:rPr>
-          <w:spacing w:val="40"/>
-        </w:rPr>
-        <w:t xml:space="preserve"> </w:t>
-      </w:r>
-      <w:r>
-        <w:t>and</w:t>
-      </w:r>
-      <w:r>
-        <w:rPr>
-          <w:spacing w:val="40"/>
-        </w:rPr>
-        <w:t xml:space="preserve"> </w:t>
-      </w:r>
-      <w:r>
-        <w:t>medical experts. Only potentially causative variants (pathogenic, likely pathogenic, or significance unknown) in genes associated with reported clinical phenotypes are included in the report. In line with</w:t>
-      </w:r>
-      <w:r>
-        <w:rPr>
-          <w:spacing w:val="-5"/>
-        </w:rPr>
-        <w:t xml:space="preserve"> </w:t>
-      </w:r>
-      <w:r>
-        <w:t>ACMG recommendations for reporting of incidental findings in clinical</w:t>
-      </w:r>
-      <w:r>
-        <w:rPr>
-          <w:spacing w:val="33"/>
-        </w:rPr>
-        <w:t xml:space="preserve"> </w:t>
-      </w:r>
-      <w:r>
-        <w:t>exome</w:t>
-      </w:r>
-      <w:r>
-        <w:rPr>
-          <w:spacing w:val="33"/>
-        </w:rPr>
-        <w:t xml:space="preserve"> </w:t>
-      </w:r>
-      <w:r>
-        <w:t>and</w:t>
-      </w:r>
-      <w:r>
-        <w:rPr>
-          <w:spacing w:val="33"/>
-        </w:rPr>
-        <w:t xml:space="preserve"> </w:t>
-      </w:r>
-      <w:r>
-        <w:t>genome</w:t>
-      </w:r>
-      <w:r>
-        <w:rPr>
-          <w:spacing w:val="33"/>
-        </w:rPr>
-        <w:t xml:space="preserve"> </w:t>
-      </w:r>
-      <w:r>
-        <w:t>sequencing</w:t>
-      </w:r>
-      <w:r>
-        <w:rPr>
-          <w:spacing w:val="33"/>
-        </w:rPr>
-        <w:t xml:space="preserve"> </w:t>
-      </w:r>
-      <w:r>
-        <w:t>(Genetics</w:t>
-      </w:r>
-      <w:r>
-        <w:rPr>
-          <w:spacing w:val="34"/>
-        </w:rPr>
-        <w:t xml:space="preserve"> </w:t>
-      </w:r>
-      <w:r>
-        <w:t>in</w:t>
-      </w:r>
-      <w:r>
-        <w:rPr>
-          <w:spacing w:val="33"/>
-        </w:rPr>
-        <w:t xml:space="preserve"> </w:t>
-      </w:r>
-      <w:r>
-        <w:t>Medicine,</w:t>
-      </w:r>
-      <w:r>
-        <w:rPr>
-          <w:spacing w:val="33"/>
-        </w:rPr>
-        <w:t xml:space="preserve"> </w:t>
-      </w:r>
-      <w:r>
-        <w:t>2021),</w:t>
-      </w:r>
-      <w:r>
-        <w:rPr>
-          <w:spacing w:val="33"/>
-        </w:rPr>
-        <w:t xml:space="preserve"> </w:t>
-      </w:r>
-      <w:r>
-        <w:t>we</w:t>
-      </w:r>
-      <w:r>
-        <w:rPr>
-          <w:spacing w:val="33"/>
-        </w:rPr>
-        <w:t xml:space="preserve"> </w:t>
-      </w:r>
-      <w:r>
-        <w:t>report</w:t>
-      </w:r>
-      <w:r>
-        <w:rPr>
-          <w:spacing w:val="34"/>
-        </w:rPr>
-        <w:t xml:space="preserve"> </w:t>
-      </w:r>
-      <w:r>
-        <w:t>incidental</w:t>
-      </w:r>
-      <w:r>
-        <w:rPr>
-          <w:spacing w:val="33"/>
-        </w:rPr>
-        <w:t xml:space="preserve"> </w:t>
-      </w:r>
-      <w:r>
-        <w:t>findings,</w:t>
-      </w:r>
-      <w:r>
-        <w:rPr>
-          <w:spacing w:val="33"/>
-        </w:rPr>
-        <w:t xml:space="preserve"> </w:t>
-      </w:r>
-      <w:r>
-        <w:t>i.e.</w:t>
-      </w:r>
-      <w:r>
-        <w:rPr>
-          <w:spacing w:val="33"/>
-        </w:rPr>
-        <w:t xml:space="preserve"> </w:t>
-      </w:r>
-      <w:r>
-        <w:t>pathogenic</w:t>
-      </w:r>
-      <w:r>
-        <w:rPr>
-          <w:spacing w:val="33"/>
-        </w:rPr>
-        <w:t xml:space="preserve"> </w:t>
-      </w:r>
-      <w:r>
-        <w:rPr>
-          <w:spacing w:val="-2"/>
-        </w:rPr>
-        <w:t>variants</w:t>
-      </w:r>
-    </w:p>
-    <w:p>
-      <w:pPr>
-        <w:pStyle w:val="BodyText"/>
-        <w:spacing w:before="87" w:line="237" w:lineRule="auto"/>
-        <w:ind w:left="305" w:right="299"/>
-        <w:jc w:val="both"/>
-      </w:pPr>
-      <w:r>
-        <w:t>(class 1) and likely pathogenic variants (class 2) only in the recommended genes for the recommended phenotypes. To also exclude mistaken identity in your clinic, several guidelines recommend testing a second sample that is independently obtained from the proband. Please note that any further analysis will result in additional costs. The classification of variants can change over</w:t>
-      </w:r>
-      <w:r>
-        <w:rPr>
-          <w:spacing w:val="30"/>
-        </w:rPr>
-        <w:t xml:space="preserve"> </w:t>
-      </w:r>
-      <w:r>
-        <w:t>the</w:t>
-      </w:r>
-      <w:r>
-        <w:rPr>
-          <w:spacing w:val="30"/>
-        </w:rPr>
-        <w:t xml:space="preserve"> </w:t>
-      </w:r>
-      <w:r>
-        <w:t>time.</w:t>
-      </w:r>
-      <w:r>
-        <w:rPr>
-          <w:spacing w:val="30"/>
-        </w:rPr>
-        <w:t xml:space="preserve"> </w:t>
-      </w:r>
-      <w:r>
-        <w:t>Please</w:t>
-      </w:r>
-      <w:r>
-        <w:rPr>
-          <w:spacing w:val="30"/>
-        </w:rPr>
-        <w:t xml:space="preserve"> </w:t>
-      </w:r>
-      <w:r>
-        <w:t>feel</w:t>
-      </w:r>
-      <w:r>
-        <w:rPr>
-          <w:spacing w:val="30"/>
-        </w:rPr>
-        <w:t xml:space="preserve"> </w:t>
-      </w:r>
-      <w:r>
-        <w:t>free</w:t>
-      </w:r>
-      <w:r>
-        <w:rPr>
-          <w:spacing w:val="30"/>
-        </w:rPr>
-        <w:t xml:space="preserve"> </w:t>
-      </w:r>
-      <w:r>
-        <w:t>to</w:t>
-      </w:r>
-      <w:r>
-        <w:rPr>
-          <w:spacing w:val="30"/>
-        </w:rPr>
-        <w:t xml:space="preserve"> </w:t>
-      </w:r>
-      <w:r>
-        <w:t>contact</w:t>
-      </w:r>
-      <w:r>
-        <w:rPr>
-          <w:spacing w:val="30"/>
-        </w:rPr>
-        <w:t xml:space="preserve"> </w:t>
-      </w:r>
-      <w:r>
-        <w:t>Genetics</w:t>
-      </w:r>
-      <w:r>
-        <w:rPr>
-          <w:spacing w:val="30"/>
-        </w:rPr>
-        <w:t xml:space="preserve"> </w:t>
-      </w:r>
-      <w:hyperlink r:id="rId8" w:history="1">
-        <w:r>
-          <w:rPr>
-            <w:rStyle w:val="Hyperlink"/>
-          </w:rPr>
-          <w:t>(info@genetics.com)</w:t>
-        </w:r>
-      </w:hyperlink>
-      <w:r>
-        <w:rPr>
-          <w:spacing w:val="30"/>
-        </w:rPr>
-        <w:t xml:space="preserve"> </w:t>
-      </w:r>
-      <w:r>
-        <w:t>in</w:t>
-      </w:r>
-      <w:r>
-        <w:rPr>
-          <w:spacing w:val="30"/>
-        </w:rPr>
-        <w:t xml:space="preserve"> </w:t>
-      </w:r>
-      <w:r>
-        <w:t>the</w:t>
-      </w:r>
-      <w:r>
-        <w:rPr>
-          <w:spacing w:val="30"/>
-        </w:rPr>
-        <w:t xml:space="preserve"> </w:t>
-      </w:r>
-      <w:r>
-        <w:t>future</w:t>
-      </w:r>
-      <w:r>
-        <w:rPr>
-          <w:spacing w:val="30"/>
-        </w:rPr>
-        <w:t xml:space="preserve"> </w:t>
-      </w:r>
-      <w:r>
-        <w:t>to</w:t>
-      </w:r>
-      <w:r>
-        <w:rPr>
-          <w:spacing w:val="30"/>
-        </w:rPr>
-        <w:t xml:space="preserve"> </w:t>
-      </w:r>
-      <w:r>
-        <w:t>determine</w:t>
-      </w:r>
-      <w:r>
-        <w:rPr>
-          <w:spacing w:val="30"/>
-        </w:rPr>
-        <w:t xml:space="preserve"> </w:t>
-      </w:r>
-      <w:r>
-        <w:t>if</w:t>
-      </w:r>
-      <w:r>
-        <w:rPr>
-          <w:spacing w:val="30"/>
-        </w:rPr>
-        <w:t xml:space="preserve"> </w:t>
-      </w:r>
-      <w:r>
-        <w:t>there have been any changes in classification of any reported variants.</w:t>
-      </w:r>
-    </w:p>
-    <w:p>
-      <w:pPr>
-        <w:pStyle w:val="BodyText"/>
-        <w:rPr>
-          <w:sz w:val="20"/>
-        </w:rPr>
-      </w:pPr>
+        <w:rPr>
+          <w:lang w:val="vi-VN"/>
+        </w:rPr>
+      </w:pPr>
+      <w:r>
+        <w:rPr>
+          <w:lang w:val="vi-VN"/>
+        </w:rPr>
+        <w:t>This pipeline was developed and validated for clinical research and diagnostic support purposes. Variant interpretation and reporting are reviewed by qualified scientific and medical personnel. Only variants classified as Pathogenic, Likely Pathogenic, or of Uncertain Significance in genes associated with the patient's reported clinical phenotype are included in this report. Benign and Likely Benign variants are not reported. In accordance with ACMG recommendations for the reporting of secondary findings in clinical sequencing (Green et al., Genetics in Medicine, 2021), pathogenic and likely pathogenic secondary findings in ACMG-recommended genes may be reported at the discretion of the ordering physician. To minimize the risk of sample mix-up, guidelines recommend confirmatory testing from an independently collected specimen when clinical discordance is observed. Variant classification is subject to change as new scientific evidence emerges. Please contact the reporting laboratory for re-evaluation of previously reported variants. Any further analysis beyond the scope of this report will result in additional costs.</w:t>
+      </w:r>
     </w:p>
     <w:p>
       <w:pPr>
@@ -3161,6 +2167,7 @@
         <w:spacing w:before="201"/>
         <w:rPr>
           <w:sz w:val="20"/>
+          <w:lang w:val="vi-VN"/>
         </w:rPr>
       </w:pPr>
     </w:p>
@@ -3205,6 +2212,7 @@
                 <w:color w:val="2B99C1"/>
                 <w:sz w:val="19"/>
               </w:rPr>
+              <w:lastRenderedPageBreak/>
               <w:t>GENETICS</w:t>
             </w:r>
             <w:r>
@@ -4311,7 +3319,7 @@
                           <pic:cNvPicPr/>
                         </pic:nvPicPr>
                         <pic:blipFill>
-                          <a:blip r:embed="rId9" cstate="print"/>
+                          <a:blip r:embed="rId8" cstate="print"/>
                           <a:stretch>
                             <a:fillRect/>
                           </a:stretch>
@@ -5148,7 +4156,7 @@
             </wp:anchor>
           </w:drawing>
         </mc:Choice>
-        <mc:Fallback xmlns:pic="http://schemas.openxmlformats.org/drawingml/2006/picture" xmlns:a="http://schemas.openxmlformats.org/drawingml/2006/main" xmlns:ve="http://schemas.openxmlformats.org/markup-compatibility/2006">
+        <mc:Fallback xmlns:ve="http://schemas.openxmlformats.org/markup-compatibility/2006" xmlns:a="http://schemas.openxmlformats.org/drawingml/2006/main" xmlns:pic="http://schemas.openxmlformats.org/drawingml/2006/picture">
           <w:pict>
             <v:rect style="position:absolute;margin-left:33.299999pt;margin-top:738pt;width:545.400022pt;height:.6pt;mso-position-horizontal-relative:page;mso-position-vertical-relative:page;z-index:-15927296" id="docshape19" filled="true" fillcolor="#2b99c1" stroked="false">
               <v:fill type="solid"/>
@@ -5787,7 +4795,6 @@
       <w:lvlJc w:val="left"/>
       <w:pPr>
         <w:ind w:left="306" w:hanging="214"/>
-        <w:jc w:val="left"/>
       </w:pPr>
       <w:rPr>
         <w:rFonts w:ascii="Arial" w:eastAsia="Arial" w:hAnsi="Arial" w:cs="Arial" w:hint="default"/>
@@ -6315,7 +5322,6 @@
   <w:style w:type="character" w:default="1" w:styleId="DefaultParagraphFont">
     <w:name w:val="Default Paragraph Font"/>
     <w:uiPriority w:val="1"/>
-    <w:semiHidden/>
     <w:unhideWhenUsed/>
   </w:style>
   <w:style w:type="table" w:default="1" w:styleId="TableNormal">

</xml_diff>